<commit_message>
chore(storage): close chat photos in the uploads bucket with an access policy
Chat photos share the bucket with public profile photos, and the bucket
allowed anonymous reads of every object, so a chat photo opened by its
direct URL without any check. The policy applied on 2026-09-27 allows
anonymous reads only for avatars, profile-media, courts, game-reports and
personal-activities, and full access for the app's service account and
the owner. A direct chat photo URL now answers 403; avatars and profile
photos still open.

The policy, how to apply and undo it, and the rule that a new public
folder must be listed are in deploy/object-storage/. Document 08 records
the change.

Co-Authored-By: Claude Opus 5.5 <noreply@anthropic.com>
</commit_message>
<xml_diff>
--- a/docs/legal/2026-09-08/deliverables/08_Переписка_техническое_описание_ОРИ.docx
+++ b/docs/legal/2026-09-08/deliverables/08_Переписка_техническое_описание_ОРИ.docx
@@ -397,7 +397,7 @@
     </w:p>
     <w:p>
       <w:r>
-        <w:t>3. Фотографии загружаются заранее отдельным запросом в Yandex Object Storage; сообщение ссылается на них. Приложение показывает фото только через сервер, который проверяет участие в чате, и прямой адрес файла клиентам не выдаёт. Сам бакет общий с публичными фото профиля и сейчас открыт на чтение по прямой ссылке; адрес файла содержит случайный идентификатор (UUID), подобрать его нельзя, но папку chat-media нужно закрыть политикой бакета (раздел 5).</w:t>
+        <w:t>3. Фотографии загружаются заранее отдельным запросом в Yandex Object Storage; сообщение ссылается на них. Приложение показывает фото только через сервер, который проверяет участие в чате, и прямой адрес файла клиентам не выдаёт. Бакет общий с публичными фото профиля, но с 27 сентября 2026 года его политика доступа разрешает анонимное чтение только папок публичных фото; файлы из chat-media по прямой ссылке не отдаются (ответ 403). До этой даты они открывались по прямой ссылке, адрес которой содержит случайный идентификатор и клиентам не выдавался.</w:t>
       </w:r>
     </w:p>
     <w:p>
@@ -823,7 +823,7 @@
               <w:rPr>
                 <w:sz w:val="18"/>
               </w:rPr>
-              <w:t>Фотографии из чатов в папке chat-media; прямой доступ по ссылке пока открыт</w:t>
+              <w:t>Фотографии из чатов в папке chat-media; доступ только у приложения (политика бакета)</w:t>
             </w:r>
           </w:p>
         </w:tc>
@@ -1906,7 +1906,7 @@
     </w:p>
     <w:p>
       <w:r>
-        <w:t>5. Закрыть папку chat-media в бакете от чтения по прямой ссылке (политика бакета в Яндекс Облаке) или перенести фото из чатов в отдельный закрытый бакет.</w:t>
+        <w:t>5. Закрыть папку chat-media от чтения по прямой ссылке — сделано 27 сентября 2026 года политикой бакета (файл deploy/object-storage/uploads-bucket-policy.json в репозитории): анонимное чтение разрешено только папкам avatars, profile-media, courts, game-reports и personal-activities, полный доступ — сервисному аккаунту приложения и владельцу.</w:t>
       </w:r>
     </w:p>
     <w:p>

</xml_diff>